<commit_message>
Add public reproducibility repository URL to the paper
</commit_message>
<xml_diff>
--- a/paper.docx
+++ b/paper.docx
@@ -11397,7 +11397,7 @@
         <w:rPr>
           <w:sz w:val="20"/>
         </w:rPr>
-        <w:t>. Remaining budgets are in Appendix A. The public archive URL and DOI will be added on posting.</w:t>
+        <w:t>. Remaining budgets are in Appendix A. Code and data are available at https://github.com/alanaqrawi/guardrail-survival-under-compaction; an archival DOI (Zenodo) will be added on posting.</w:t>
       </w:r>
     </w:p>
     <w:p>
@@ -11551,7 +11551,7 @@
         <w:rPr>
           <w:sz w:val="20"/>
         </w:rPr>
-        <w:t>, and the replay contrast) will be released in the public reproducibility repository with a DOI on publication.</w:t>
+        <w:t>, and the replay contrast) are available in the public reproducibility repository at https://github.com/alanaqrawi/guardrail-survival-under-compaction (archival DOI to follow).</w:t>
       </w:r>
     </w:p>
     <w:sectPr>

</xml_diff>